<commit_message>
feat(relaunch): wire Tournament champion rewards (winner-take-all)
The last-team-standing Tournament had no payout. Each SURVIVING member of the
winning team -- whether they cleared all 8 waves or were the last team standing
-- now receives 2,500 Hunt Marks + 500 Infamy (+ Infamy_Lifetime) and a
Tournament_Wins lifetime stat. Losing teams get nothing (winner-take-all, per
owner). Rewards granted at the two win paths (onWaveClearedForTeam + the
last-team-standing branch of eliminateTeam); each champion is rewarded exactly
once and a server-wide announce calls out the prize. Amounts are tunable
constants (CHAMPION_MARKS / CHAMPION_INFAMY) at the top of Tournament.lua.

Also refreshed RELAUNCH_AS_BUILT.md/.docx (Tournament row + §6) and folded in
the wardrobe-conflict docx that couldn't regenerate last commit (Word lock).

Co-Authored-By: Claude Opus 4.8 <noreply@anthropic.com>
</commit_message>
<xml_diff>
--- a/RELAUNCH_AS_BUILT.docx
+++ b/RELAUNCH_AS_BUILT.docx
@@ -4206,16 +4206,13 @@
           </w:tcPr>
           <w:p>
             <w:r>
-              <w:t xml:space="preserve">⚠ </w:t>
-            </w:r>
-            <w:r>
               <w:rPr>
                 <w:b/>
               </w:rPr>
-              <w:t>no reward coded</w:t>
+              <w:t>2,500 marks + 500 Infamy</w:t>
             </w:r>
             <w:r>
-              <w:t xml:space="preserve"> (bragging rights only)</w:t>
+              <w:t xml:space="preserve"> per surviving champion (winner-take-all)</w:t>
             </w:r>
           </w:p>
         </w:tc>
@@ -4785,11 +4782,67 @@
       </w:r>
     </w:p>
     <w:p>
+      <w:pPr>
+        <w:pStyle w:val="ListBullet"/>
+      </w:pPr>
       <w:r>
         <w:rPr>
           <w:b/>
         </w:rPr>
-        <w:t>Still disabled / stubbed (intentional or needs a design call):</w:t>
+        <w:t>Wardrobe `charCreate` conflict resolved</w:t>
+      </w:r>
+      <w:r>
+        <w:t xml:space="preserve"> — removed </w:t>
+      </w:r>
+      <w:r>
+        <w:rPr>
+          <w:rFonts w:ascii="Consolas" w:hAnsi="Consolas"/>
+          <w:sz w:val="19"/>
+        </w:rPr>
+        <w:t>mission_wardrobe_unlocks.lua</w:t>
+      </w:r>
+      <w:r>
+        <w:t xml:space="preserve"> (it zeroed all 8 wardrobes at creation to gate them behind missions, fighting the give-everything design, and its mission-grant hook was dead because missions are auto-completed via </w:t>
+      </w:r>
+      <w:r>
+        <w:rPr>
+          <w:rFonts w:ascii="Consolas" w:hAnsi="Consolas"/>
+          <w:sz w:val="19"/>
+        </w:rPr>
+        <w:t>setMissionStatus</w:t>
+      </w:r>
+      <w:r>
+        <w:t xml:space="preserve"> not </w:t>
+      </w:r>
+      <w:r>
+        <w:rPr>
+          <w:rFonts w:ascii="Consolas" w:hAnsi="Consolas"/>
+          <w:sz w:val="19"/>
+        </w:rPr>
+        <w:t>npcUtil.completeMission</w:t>
+      </w:r>
+      <w:r>
+        <w:t xml:space="preserve">). </w:t>
+      </w:r>
+      <w:r>
+        <w:rPr>
+          <w:rFonts w:ascii="Consolas" w:hAnsi="Consolas"/>
+          <w:sz w:val="19"/>
+        </w:rPr>
+        <w:t>new_char_wardrobe_sizes.lua</w:t>
+      </w:r>
+      <w:r>
+        <w:t xml:space="preserve"> is now the single deterministic charCreate owner; </w:t>
+      </w:r>
+      <w:r>
+        <w:rPr>
+          <w:rFonts w:ascii="Consolas" w:hAnsi="Consolas"/>
+          <w:sz w:val="19"/>
+        </w:rPr>
+        <w:t>Character_Upgrader</w:t>
+      </w:r>
+      <w:r>
+        <w:t xml:space="preserve"> re-affirms on first login. New chars reliably get 8 full wardrobes.</w:t>
       </w:r>
     </w:p>
     <w:p>
@@ -4798,6 +4851,57 @@
       </w:pPr>
       <w:r>
         <w:rPr>
+          <w:b/>
+        </w:rPr>
+        <w:t>Tournament rewards wired</w:t>
+      </w:r>
+      <w:r>
+        <w:t xml:space="preserve"> — each surviving member of the winning team (cleared all 8 waves, or last team standing) now gets </w:t>
+      </w:r>
+      <w:r>
+        <w:rPr>
+          <w:b/>
+        </w:rPr>
+        <w:t>2,500 Hunt Marks + 500 Infamy</w:t>
+      </w:r>
+      <w:r>
+        <w:t xml:space="preserve"> + a </w:t>
+      </w:r>
+      <w:r>
+        <w:rPr>
+          <w:rFonts w:ascii="Consolas" w:hAnsi="Consolas"/>
+          <w:sz w:val="19"/>
+        </w:rPr>
+        <w:t>Tournament_Wins</w:t>
+      </w:r>
+      <w:r>
+        <w:t xml:space="preserve"> stat (winner-take-all; losing teams get nothing). Amounts are tunable constants at the top of </w:t>
+      </w:r>
+      <w:r>
+        <w:rPr>
+          <w:rFonts w:ascii="Consolas" w:hAnsi="Consolas"/>
+          <w:sz w:val="19"/>
+        </w:rPr>
+        <w:t>Tournament.lua</w:t>
+      </w:r>
+      <w:r>
+        <w:t>.</w:t>
+      </w:r>
+    </w:p>
+    <w:p>
+      <w:r>
+        <w:rPr>
+          <w:b/>
+        </w:rPr>
+        <w:t>Still disabled / stubbed (intentional or needs a design call):</w:t>
+      </w:r>
+    </w:p>
+    <w:p>
+      <w:pPr>
+        <w:pStyle w:val="ListBullet"/>
+      </w:pPr>
+      <w:r>
+        <w:rPr>
           <w:rFonts w:ascii="Consolas" w:hAnsi="Consolas"/>
           <w:sz w:val="19"/>
         </w:rPr>
@@ -4868,10 +4972,20 @@
         <w:rPr>
           <w:b/>
         </w:rPr>
-        <w:t>Tournament</w:t>
-      </w:r>
-      <w:r>
-        <w:t xml:space="preserve"> awards no rewards (bragging rights only) — needs a reward design before wiring.</w:t>
+        <w:t>Seasonal events</w:t>
+      </w:r>
+      <w:r>
+        <w:t xml:space="preserve"> engine works but nothing is scheduled (dormant until a GM runs </w:t>
+      </w:r>
+      <w:r>
+        <w:rPr>
+          <w:rFonts w:ascii="Consolas" w:hAnsi="Consolas"/>
+          <w:sz w:val="19"/>
+        </w:rPr>
+        <w:t>!setbonus</w:t>
+      </w:r>
+      <w:r>
+        <w:t>).</w:t>
       </w:r>
     </w:p>
     <w:p>
@@ -4880,22 +4994,13 @@
       </w:pPr>
       <w:r>
         <w:rPr>
-          <w:b/>
-        </w:rPr>
-        <w:t>Seasonal events</w:t>
-      </w:r>
-      <w:r>
-        <w:t xml:space="preserve"> engine works but nothing is scheduled (dormant until a GM runs </w:t>
-      </w:r>
-      <w:r>
-        <w:rPr>
           <w:rFonts w:ascii="Consolas" w:hAnsi="Consolas"/>
           <w:sz w:val="19"/>
         </w:rPr>
-        <w:t>!setbonus</w:t>
-      </w:r>
-      <w:r>
-        <w:t>).</w:t>
+        <w:t>trust_meat_vendor</w:t>
+      </w:r>
+      <w:r>
+        <w:t xml:space="preserve"> — retired no-op (folded into Void Keeper).</w:t>
       </w:r>
     </w:p>
     <w:p>
@@ -4903,21 +5008,6 @@
         <w:pStyle w:val="ListBullet"/>
       </w:pPr>
       <w:r>
-        <w:rPr>
-          <w:rFonts w:ascii="Consolas" w:hAnsi="Consolas"/>
-          <w:sz w:val="19"/>
-        </w:rPr>
-        <w:t>trust_meat_vendor</w:t>
-      </w:r>
-      <w:r>
-        <w:t xml:space="preserve"> — retired no-op (folded into Void Keeper).</w:t>
-      </w:r>
-    </w:p>
-    <w:p>
-      <w:pPr>
-        <w:pStyle w:val="ListBullet"/>
-      </w:pPr>
-      <w:r>
         <w:t xml:space="preserve">Augment Sage </w:t>
       </w:r>
       <w:r>
@@ -4947,20 +5037,6 @@
           <w:b/>
         </w:rPr>
         <w:t>Still open (needs care or a C++ rebuild):</w:t>
-      </w:r>
-    </w:p>
-    <w:p>
-      <w:pPr>
-        <w:pStyle w:val="ListBullet"/>
-      </w:pPr>
-      <w:r>
-        <w:rPr>
-          <w:b/>
-        </w:rPr>
-        <w:t>Wardrobe `charCreate` conflict</w:t>
-      </w:r>
-      <w:r>
-        <w:t xml:space="preserve"> — three modules fight over sizing; outcome is order-fragile (left alone — needs a deliberate dedup).</w:t>
       </w:r>
     </w:p>
     <w:p>

</xml_diff>

<commit_message>
docs(relaunch): document Spell & Skill Mastery; drop retired AoE-WS
The mastery rollout retired the Rupture Sage / AoE-Weapon-Skill feature
(commit a22038d3b5) and replaced it with the Spell & Skill Mastery system,
which wasn't yet in the as-built doc. Added §4.4 (Mastery Sage NPC, Mastery
Sigils currency, daily NM rotation faucet, potency/WS-effects/trait-rider
upgrades), added Mastery Sigils to the §1 currency table, and corrected the
stale §6 "!aoews added" line (the feature + that fix are gone). Regenerated
the .docx. (Code-grounded from spell_skill_mastery_catalog.lua + empower.lua;
balance values are placeholders pending playtest.)

Co-Authored-By: Claude Opus 4.8 <noreply@anthropic.com>
</commit_message>
<xml_diff>
--- a/RELAUNCH_AS_BUILT.docx
+++ b/RELAUNCH_AS_BUILT.docx
@@ -48,7 +48,7 @@
           <w:rFonts w:ascii="Consolas" w:hAnsi="Consolas"/>
           <w:sz w:val="19"/>
         </w:rPr>
-        <w:t>eea34e083e</w:t>
+        <w:t>43c2ede8f8</w:t>
       </w:r>
       <w:r>
         <w:t xml:space="preserve">). It documents what the code </w:t>
@@ -339,7 +339,7 @@
           </w:tcPr>
           <w:p>
             <w:r>
-              <w:t>Medal trio, Sortie earrings, custom spells; also the Ascension ascend cost</w:t>
+              <w:t>Medal trio, Sortie earrings, the 3 Void-Keeper custom trusts, NM-affinity registration; also the Ascension ascend cost</w:t>
             </w:r>
           </w:p>
         </w:tc>
@@ -596,6 +596,58 @@
           </w:p>
         </w:tc>
       </w:tr>
+      <w:tr>
+        <w:tc>
+          <w:tcPr>
+            <w:tcW w:type="dxa" w:w="2160"/>
+          </w:tcPr>
+          <w:p>
+            <w:r>
+              <w:rPr>
+                <w:b/>
+              </w:rPr>
+              <w:t>Mastery Sigils</w:t>
+            </w:r>
+          </w:p>
+        </w:tc>
+        <w:tc>
+          <w:tcPr>
+            <w:tcW w:type="dxa" w:w="2160"/>
+          </w:tcPr>
+          <w:p>
+            <w:r>
+              <w:t xml:space="preserve">charVar </w:t>
+            </w:r>
+            <w:r>
+              <w:rPr>
+                <w:rFonts w:ascii="Consolas" w:hAnsi="Consolas"/>
+                <w:sz w:val="19"/>
+              </w:rPr>
+              <w:t>MasterySigils</w:t>
+            </w:r>
+          </w:p>
+        </w:tc>
+        <w:tc>
+          <w:tcPr>
+            <w:tcW w:type="dxa" w:w="2160"/>
+          </w:tcPr>
+          <w:p>
+            <w:r>
+              <w:t>daily NM rotation (50 per live target) + small trickle on any NM</w:t>
+            </w:r>
+          </w:p>
+        </w:tc>
+        <w:tc>
+          <w:tcPr>
+            <w:tcW w:type="dxa" w:w="2160"/>
+          </w:tcPr>
+          <w:p>
+            <w:r>
+              <w:t>Spell &amp; Skill Mastery — WS/spell potency, WS-effect procs, trait riders</w:t>
+            </w:r>
+          </w:p>
+        </w:tc>
+      </w:tr>
     </w:tbl>
     <w:p/>
     <w:p>
@@ -643,7 +695,89 @@
         <w:t>Leafallia</w:t>
       </w:r>
       <w:r>
-        <w:t>. (Exact zone IDs/coords are in flux in the catalogs pending an in-game pass — treat NPC locations here as approximate.)</w:t>
+        <w:t xml:space="preserve">. The three </w:t>
+      </w:r>
+      <w:r>
+        <w:rPr>
+          <w:b/>
+        </w:rPr>
+        <w:t>Escha-RuAun (zone 289)</w:t>
+      </w:r>
+      <w:r>
+        <w:t xml:space="preserve"> content NPCs were spread far apart for relaunch so concurrent groups don't collide, and </w:t>
+      </w:r>
+      <w:r>
+        <w:rPr>
+          <w:b/>
+        </w:rPr>
+        <w:t>each is now placed as 3 interchangeable copies</w:t>
+      </w:r>
+      <w:r>
+        <w:t xml:space="preserve"> (~8 units apart) so several players can start independent runs at once: the </w:t>
+      </w:r>
+      <w:r>
+        <w:rPr>
+          <w:b/>
+        </w:rPr>
+        <w:t>Voidspire Warden</w:t>
+      </w:r>
+      <w:r>
+        <w:t xml:space="preserve"> sits on the </w:t>
+      </w:r>
+      <w:r>
+        <w:rPr>
+          <w:b/>
+        </w:rPr>
+        <w:t>south / entry plaza</w:t>
+      </w:r>
+      <w:r>
+        <w:t xml:space="preserve">, the </w:t>
+      </w:r>
+      <w:r>
+        <w:rPr>
+          <w:b/>
+        </w:rPr>
+        <w:t>Star-Devourer "Voidgate Sentinel" (Raid)</w:t>
+      </w:r>
+      <w:r>
+        <w:t xml:space="preserve"> in the </w:t>
+      </w:r>
+      <w:r>
+        <w:rPr>
+          <w:b/>
+        </w:rPr>
+        <w:t>north</w:t>
+      </w:r>
+      <w:r>
+        <w:t xml:space="preserve"> area, and the </w:t>
+      </w:r>
+      <w:r>
+        <w:rPr>
+          <w:b/>
+        </w:rPr>
+        <w:t>Game Master</w:t>
+      </w:r>
+      <w:r>
+        <w:t xml:space="preserve"> (</w:t>
+      </w:r>
+      <w:r>
+        <w:rPr>
+          <w:rFonts w:ascii="Consolas" w:hAnsi="Consolas"/>
+          <w:sz w:val="19"/>
+        </w:rPr>
+        <w:t>!wavemaster</w:t>
+      </w:r>
+      <w:r>
+        <w:t xml:space="preserve"> wave-survival system) in the </w:t>
+      </w:r>
+      <w:r>
+        <w:rPr>
+          <w:b/>
+        </w:rPr>
+        <w:t>west</w:t>
+      </w:r>
+      <w:r>
+        <w:t xml:space="preserve"> area. (Exact zone IDs/coords are in flux in the catalogs pending an in-game pass — treat NPC locations here as approximate.)</w:t>
       </w:r>
     </w:p>
     <w:p/>
@@ -944,7 +1078,17 @@
     </w:p>
     <w:p>
       <w:r>
-        <w:t>Retail leveling is intact but heavily accelerated and supplemented:</w:t>
+        <w:t xml:space="preserve">Retail leveling is intact but supplemented. *(Relaunch removed the always-on "Gain Experience" RoE module and the </w:t>
+      </w:r>
+      <w:r>
+        <w:rPr>
+          <w:rFonts w:ascii="Consolas" w:hAnsi="Consolas"/>
+          <w:sz w:val="19"/>
+        </w:rPr>
+        <w:t>!gainexp</w:t>
+      </w:r>
+      <w:r>
+        <w:t xml:space="preserve"> instant-claim command; Records of Eminence revert to the retail rotation, with no forced/on-demand EXP bundle.)*</w:t>
       </w:r>
     </w:p>
     <w:p>
@@ -955,10 +1099,20 @@
         <w:rPr>
           <w:b/>
         </w:rPr>
-        <w:t>`roe_gain_exp_always_on.lua`</w:t>
-      </w:r>
-      <w:r>
-        <w:t xml:space="preserve"> — the RoE "Gain Experience" record is forced into *every* 4-hour slot of every day (vs retail's 3×/week). Claiming it = +1500 EXP / +300 sparks / +300 accolades / 1 Copper Voucher.</w:t>
+        <w:t>`!expcamp`</w:t>
+      </w:r>
+      <w:r>
+        <w:t xml:space="preserve"> — replaces the retired ExpCamp Moogle; lists 20 level-banded camps, </w:t>
+      </w:r>
+      <w:r>
+        <w:rPr>
+          <w:rFonts w:ascii="Consolas" w:hAnsi="Consolas"/>
+          <w:sz w:val="19"/>
+        </w:rPr>
+        <w:t>!expcamp &lt;N&gt;</w:t>
+      </w:r>
+      <w:r>
+        <w:t xml:space="preserve"> warps you there.</w:t>
       </w:r>
     </w:p>
     <w:p>
@@ -969,76 +1123,29 @@
         <w:rPr>
           <w:b/>
         </w:rPr>
-        <w:t>`!gainexp`</w:t>
-      </w:r>
-      <w:r>
-        <w:t xml:space="preserve"> — on-demand instant claim of that same bundle, </w:t>
+        <w:t>`subjob_exp_share.lua`</w:t>
+      </w:r>
+      <w:r>
+        <w:t xml:space="preserve"> — banks </w:t>
       </w:r>
       <w:r>
         <w:rPr>
           <w:b/>
         </w:rPr>
-        <w:t>all players, 24 h cooldown</w:t>
-      </w:r>
-      <w:r>
-        <w:t xml:space="preserve"> (the header comment claiming "GM-only, no cooldown" is stale).</w:t>
-      </w:r>
-    </w:p>
-    <w:p>
-      <w:pPr>
-        <w:pStyle w:val="ListBullet"/>
-      </w:pPr>
-      <w:r>
-        <w:rPr>
-          <w:b/>
-        </w:rPr>
-        <w:t>`!expcamp`</w:t>
-      </w:r>
-      <w:r>
-        <w:t xml:space="preserve"> — replaces the retired ExpCamp Moogle; lists 20 level-banded camps, </w:t>
+        <w:t>25%</w:t>
+      </w:r>
+      <w:r>
+        <w:t xml:space="preserve"> of *every* EXP gain toward your active subjob, auto-leveling it in the background (capped at main-job level). Curve mirrors the real </w:t>
       </w:r>
       <w:r>
         <w:rPr>
           <w:rFonts w:ascii="Consolas" w:hAnsi="Consolas"/>
           <w:sz w:val="19"/>
         </w:rPr>
-        <w:t>!expcamp &lt;N&gt;</w:t>
-      </w:r>
-      <w:r>
-        <w:t xml:space="preserve"> warps you there.</w:t>
-      </w:r>
-    </w:p>
-    <w:p>
-      <w:pPr>
-        <w:pStyle w:val="ListBullet"/>
-      </w:pPr>
-      <w:r>
-        <w:rPr>
-          <w:b/>
-        </w:rPr>
-        <w:t>`subjob_exp_share.lua`</w:t>
-      </w:r>
-      <w:r>
-        <w:t xml:space="preserve"> — banks </w:t>
-      </w:r>
-      <w:r>
-        <w:rPr>
-          <w:b/>
-        </w:rPr>
-        <w:t>50%</w:t>
-      </w:r>
-      <w:r>
-        <w:t xml:space="preserve"> of *every* EXP gain toward your active subjob, auto-leveling it in the background (capped at main-job level). Curve mirrors the real </w:t>
-      </w:r>
-      <w:r>
-        <w:rPr>
-          <w:rFonts w:ascii="Consolas" w:hAnsi="Consolas"/>
-          <w:sz w:val="19"/>
-        </w:rPr>
         <w:t>exp_base</w:t>
       </w:r>
       <w:r>
-        <w:t xml:space="preserve"> table. Switching subs wipes the bank (no transfer). Jobs that have been through Job Rebirth are excluded (must be re-grinded as a main).</w:t>
+        <w:t xml:space="preserve"> table. Switching subs wipes the bank (no transfer). Jobs that have been through Job Rebirth are excluded (must be re-grinded as a main). *(Relaunch cut the share rate 50%→25%; the in-file "0.5" comments are now stale.)*</w:t>
       </w:r>
     </w:p>
     <w:p>
@@ -1228,7 +1335,7 @@
           </w:tcPr>
           <w:p>
             <w:r>
-              <w:t>75</w:t>
+              <w:t>150</w:t>
             </w:r>
           </w:p>
         </w:tc>
@@ -1270,7 +1377,7 @@
           </w:tcPr>
           <w:p>
             <w:r>
-              <w:t>225</w:t>
+              <w:t>650</w:t>
             </w:r>
           </w:p>
         </w:tc>
@@ -1312,7 +1419,7 @@
           </w:tcPr>
           <w:p>
             <w:r>
-              <w:t>500</w:t>
+              <w:t>1,500</w:t>
             </w:r>
           </w:p>
         </w:tc>
@@ -1354,7 +1461,7 @@
           </w:tcPr>
           <w:p>
             <w:r>
-              <w:t>1,000</w:t>
+              <w:t>3,000</w:t>
             </w:r>
           </w:p>
         </w:tc>
@@ -1395,10 +1502,10 @@
         <w:rPr>
           <w:b/>
         </w:rPr>
-        <w:t>1,800 marks</w:t>
-      </w:r>
-      <w:r>
-        <w:t xml:space="preserve">. NMs are Lv150 (Shinryu Lv225-250) with big HP boosts (6×→36×, Shinryu 72×). Mark payout stacks bonuses: </w:t>
+        <w:t>5,300 marks</w:t>
+      </w:r>
+      <w:r>
+        <w:t xml:space="preserve"> (relaunch re-priced the rank gates up from the old 75/225/500/1000). NMs are Lv150 (Shinryu Lv225-250) with big HP boosts (6×→36×, Shinryu 72×). Mark payout stacks bonuses: </w:t>
       </w:r>
       <w:r>
         <w:rPr>
@@ -1421,7 +1528,46 @@
         <w:t>HL reward shop</w:t>
       </w:r>
       <w:r>
-        <w:t xml:space="preserve"> is the bridge to gear: it sells the medal trio (Beastmens 5 / Kindreds 15 / Demons 40 marks) plus Sortie earrings (NQ 100 / +1 200) and three custom spells (Silencega 200, Convergence 350, Divine Aegis 400).</w:t>
+        <w:t xml:space="preserve"> is the bridge to gear: it sells the medal trio (Beastmens 5 / Kindreds 15 / Demons 40 marks) plus Sortie earrings (NQ 100 / +1 200). ⚠ </w:t>
+      </w:r>
+      <w:r>
+        <w:rPr>
+          <w:b/>
+        </w:rPr>
+        <w:t>Stale shop rows:</w:t>
+      </w:r>
+      <w:r>
+        <w:t xml:space="preserve"> the catalog still lists a "Spells" category (Silencega 200, Convergence 350, Divine Aegis 400) left over from the now-removed custom-spell system (§4.2) — but those rows are dead: </w:t>
+      </w:r>
+      <w:r>
+        <w:rPr>
+          <w:rFonts w:ascii="Consolas" w:hAnsi="Consolas"/>
+          <w:sz w:val="19"/>
+        </w:rPr>
+        <w:t>learnSpell</w:t>
+      </w:r>
+      <w:r>
+        <w:t xml:space="preserve"> 1020 (Divine Aegis) and 1021 (Convergence) no longer exist in </w:t>
+      </w:r>
+      <w:r>
+        <w:rPr>
+          <w:rFonts w:ascii="Consolas" w:hAnsi="Consolas"/>
+          <w:sz w:val="19"/>
+        </w:rPr>
+        <w:t>spell_list</w:t>
+      </w:r>
+      <w:r>
+        <w:t xml:space="preserve"> (only stock Silencega 359 survives), so buying them teaches nothing usable. Clean up </w:t>
+      </w:r>
+      <w:r>
+        <w:rPr>
+          <w:rFonts w:ascii="Consolas" w:hAnsi="Consolas"/>
+          <w:sz w:val="19"/>
+        </w:rPr>
+        <w:t>hunting_league_catalog.lua</w:t>
+      </w:r>
+      <w:r>
+        <w:t xml:space="preserve"> lines ~583-590.</w:t>
       </w:r>
     </w:p>
     <w:p>
@@ -1645,16 +1791,16 @@
     <w:p/>
     <w:p>
       <w:r>
-        <w:t xml:space="preserve">Each kill drops a random base piece (50% biased to your main job, cutting a set grind to ~50-80 kills) + the set's marks. Upgrade costs (own currency): </w:t>
+        <w:t xml:space="preserve">Each kill drops a random base piece (50% biased to your main job, cutting a set grind to ~50-80 kills) + the set's marks. Upgrade costs (own currency, identical across AF/Relic/Empy): </w:t>
       </w:r>
       <w:r>
         <w:rPr>
           <w:b/>
         </w:rPr>
-        <w:t>base→+1 100, +1→+2 300, +2→+3 650</w:t>
-      </w:r>
-      <w:r>
-        <w:t xml:space="preserve"> (1,050 total/piece). A Mark Exchange NPC converts between mark types with a tax (2 AF→1 Relic, 2 Relic→1 Empy, 3 AF→1 Empy).</w:t>
+        <w:t>base→+1 300, +1→+2 900, +2→+3 2,000</w:t>
+      </w:r>
+      <w:r>
+        <w:t xml:space="preserve"> (3,200 total/piece). A Mark Exchange NPC converts between mark types with a tax (2 AF→1 Relic, 2 Relic→1 Empy, 3 AF→1 Empy).</w:t>
       </w:r>
     </w:p>
     <w:p>
@@ -1986,16 +2132,36 @@
     <w:p/>
     <w:p>
       <w:r>
-        <w:t xml:space="preserve">While a job is ascended it carries a multiplicative </w:t>
+        <w:t xml:space="preserve">Ascension </w:t>
       </w:r>
       <w:r>
         <w:rPr>
           <w:b/>
         </w:rPr>
-        <w:t>EXP penalty</w:t>
-      </w:r>
-      <w:r>
-        <w:t xml:space="preserve"> (−4%/level to a −80% cap at P.Lv 20). *(Relaunch Phase 2 cut the tier-0 Court's ATT/DEF/REGEN hard; higher tiers unchanged. The cosmetic Ascension_Companion pet is </w:t>
+        <w:t>no longer carries any EXP penalty</w:t>
+      </w:r>
+      <w:r>
+        <w:t xml:space="preserve"> — relaunch removed it (the engine's </w:t>
+      </w:r>
+      <w:r>
+        <w:rPr>
+          <w:rFonts w:ascii="Consolas" w:hAnsi="Consolas"/>
+          <w:sz w:val="19"/>
+        </w:rPr>
+        <w:t>[PrestigeExpCut]</w:t>
+      </w:r>
+      <w:r>
+        <w:t xml:space="preserve"> charVar is now always set to 0 on every job-mod refresh; the old −4%/level-to-−80%-cap </w:t>
+      </w:r>
+      <w:r>
+        <w:rPr>
+          <w:rFonts w:ascii="Consolas" w:hAnsi="Consolas"/>
+          <w:sz w:val="19"/>
+        </w:rPr>
+        <w:t>expCut()</w:t>
+      </w:r>
+      <w:r>
+        <w:t xml:space="preserve"> is dead code left in place for history). *(Relaunch Phase 2 also cut the tier-0 Court's ATT/DEF/REGEN hard; higher tiers unchanged. The cosmetic Ascension_Companion pet is </w:t>
       </w:r>
       <w:r>
         <w:rPr>
@@ -2244,16 +2410,16 @@
         <w:t>does not use the shared mechanics engine</w:t>
       </w:r>
       <w:r>
-        <w:t xml:space="preserve"> (pure stat block). Clearing level 10 pays the single biggest one-shot reward on the server: </w:t>
+        <w:t xml:space="preserve"> (pure stat block). Clearing level 10 pays </w:t>
       </w:r>
       <w:r>
         <w:rPr>
           <w:b/>
         </w:rPr>
-        <w:t>500,000,000 gil + 50,000 Paragon Points + 50,000 Infamy</w:t>
-      </w:r>
-      <w:r>
-        <w:t>, and enshrines a permanent named NPC in the Hall of Champions (Riverne-Site B01). *(Note: this 500M reward is the Gauntlet's, distinct from the Legendary-branch gil cuts made elsewhere.)*</w:t>
+        <w:t>5,000,000 gil + 500 Paragon Points + 500 Infamy</w:t>
+      </w:r>
+      <w:r>
+        <w:t xml:space="preserve"> and enshrines a permanent named NPC in the Hall of Champions (Riverne-Site B01). *(Relaunch cut this reward 99% from the old 500M gil / 50k PP / 50k Infamy — it is no longer the server's biggest one-shot payout.)*</w:t>
       </w:r>
     </w:p>
     <w:p>
@@ -2948,7 +3114,16 @@
         <w:pStyle w:val="ListBullet"/>
       </w:pPr>
       <w:r>
-        <w:t xml:space="preserve">HL unlock costs re-priced to 0/75/225/500/1000; HL/Reforge/Prestige/Apex/Abyssea NM </w:t>
+        <w:t xml:space="preserve">HL unlock costs re-priced </w:t>
+      </w:r>
+      <w:r>
+        <w:rPr>
+          <w:b/>
+        </w:rPr>
+        <w:t>up</w:t>
+      </w:r>
+      <w:r>
+        <w:t xml:space="preserve"> to 0/150/650/1500/3000 (5,300 cumulative to Legend); HL/Reforge/Prestige/Apex/Abyssea NM </w:t>
       </w:r>
       <w:r>
         <w:rPr>
@@ -3104,7 +3279,7 @@
         <w:t>NM Affinities</w:t>
       </w:r>
       <w:r>
-        <w:t xml:space="preserve"> — trade one of 13 NM trophies to permanently give that stat category a </w:t>
+        <w:t xml:space="preserve"> — permanently give a stat category a </w:t>
       </w:r>
       <w:r>
         <w:rPr>
@@ -3113,7 +3288,34 @@
         <w:t>×1.5</w:t>
       </w:r>
       <w:r>
-        <w:t xml:space="preserve"> multiplier.</w:t>
+        <w:t xml:space="preserve"> multiplier. </w:t>
+      </w:r>
+      <w:r>
+        <w:rPr>
+          <w:b/>
+        </w:rPr>
+        <w:t>Relaunch-gated (2026-06-25):</w:t>
+      </w:r>
+      <w:r>
+        <w:t xml:space="preserve"> no longer a free trophy turn-in — registration now requires </w:t>
+      </w:r>
+      <w:r>
+        <w:rPr>
+          <w:b/>
+        </w:rPr>
+        <w:t>Hunting League Rank 3 (Elite)</w:t>
+      </w:r>
+      <w:r>
+        <w:t xml:space="preserve"> *and* </w:t>
+      </w:r>
+      <w:r>
+        <w:rPr>
+          <w:b/>
+        </w:rPr>
+        <w:t>1,000 Hunt Marks</w:t>
+      </w:r>
+      <w:r>
+        <w:t xml:space="preserve"> (spent), *on top of* consuming the NM trophy. One of 13 categories.</w:t>
       </w:r>
     </w:p>
     <w:p>
@@ -3344,16 +3546,7 @@
         <w:t>Enhancing magic</w:t>
       </w:r>
       <w:r>
-        <w:t xml:space="preserve"> double duration (×2 on the final value); </w:t>
-      </w:r>
-      <w:r>
-        <w:rPr>
-          <w:b/>
-        </w:rPr>
-        <w:t>custom spell commands</w:t>
-      </w:r>
-      <w:r>
-        <w:t xml:space="preserve"> </w:t>
+        <w:t xml:space="preserve"> double duration (×2 on the final value). *(The custom spell system — </w:t>
       </w:r>
       <w:r>
         <w:rPr>
@@ -3363,7 +3556,7 @@
         <w:t>!aegis</w:t>
       </w:r>
       <w:r>
-        <w:t xml:space="preserve"> (PLD), </w:t>
+        <w:t>/</w:t>
       </w:r>
       <w:r>
         <w:rPr>
@@ -3373,7 +3566,7 @@
         <w:t>!convergence</w:t>
       </w:r>
       <w:r>
-        <w:t xml:space="preserve"> (RDM), </w:t>
+        <w:t>/</w:t>
       </w:r>
       <w:r>
         <w:rPr>
@@ -3383,7 +3576,56 @@
         <w:t>!silencega</w:t>
       </w:r>
       <w:r>
-        <w:t xml:space="preserve"> (WHM/RDM/SCH) for IDs the client can't hard-cast.</w:t>
+        <w:t xml:space="preserve"> commands, their spell scripts, the </w:t>
+      </w:r>
+      <w:r>
+        <w:rPr>
+          <w:rFonts w:ascii="Consolas" w:hAnsi="Consolas"/>
+          <w:sz w:val="19"/>
+        </w:rPr>
+        <w:t>custom_spell_ids</w:t>
+      </w:r>
+      <w:r>
+        <w:t>/</w:t>
+      </w:r>
+      <w:r>
+        <w:rPr>
+          <w:rFonts w:ascii="Consolas" w:hAnsi="Consolas"/>
+          <w:sz w:val="19"/>
+        </w:rPr>
+        <w:t>custom_spell_command</w:t>
+      </w:r>
+      <w:r>
+        <w:t xml:space="preserve"> modules, </w:t>
+      </w:r>
+      <w:r>
+        <w:rPr>
+          <w:rFonts w:ascii="Consolas" w:hAnsi="Consolas"/>
+          <w:sz w:val="19"/>
+        </w:rPr>
+        <w:t>custom_spells.sql</w:t>
+      </w:r>
+      <w:r>
+        <w:t xml:space="preserve">, and the docgen — was </w:t>
+      </w:r>
+      <w:r>
+        <w:rPr>
+          <w:b/>
+        </w:rPr>
+        <w:t>removed entirely</w:t>
+      </w:r>
+      <w:r>
+        <w:t xml:space="preserve"> on relaunch. Spell IDs 1020/1021 are gone from </w:t>
+      </w:r>
+      <w:r>
+        <w:rPr>
+          <w:rFonts w:ascii="Consolas" w:hAnsi="Consolas"/>
+          <w:sz w:val="19"/>
+        </w:rPr>
+        <w:t>spell_list</w:t>
+      </w:r>
+      <w:r>
+        <w:t>; only stock Silencega 359 remains.)*</w:t>
       </w:r>
     </w:p>
     <w:p>
@@ -3405,34 +3647,151 @@
         <w:t>Void Keeper</w:t>
       </w:r>
       <w:r>
-        <w:t xml:space="preserve"> paid trusts (one NPC): </w:t>
+        <w:t xml:space="preserve"> custom trusts (one NPC, </w:t>
+      </w:r>
+      <w:r>
+        <w:rPr>
+          <w:rFonts w:ascii="Consolas" w:hAnsi="Consolas"/>
+          <w:sz w:val="19"/>
+        </w:rPr>
+        <w:t>trust_skoll.lua</w:t>
+      </w:r>
+      <w:r>
+        <w:t xml:space="preserve">): </w:t>
       </w:r>
       <w:r>
         <w:rPr>
           <w:b/>
         </w:rPr>
+        <w:t>Meat</w:t>
+      </w:r>
+      <w:r>
+        <w:t xml:space="preserve"> (budget tank), </w:t>
+      </w:r>
+      <w:r>
+        <w:rPr>
+          <w:b/>
+        </w:rPr>
         <w:t>Gemma</w:t>
       </w:r>
       <w:r>
-        <w:t xml:space="preserve"> (50M gil, full support/heal), </w:t>
+        <w:t xml:space="preserve"> (full support/heal), </w:t>
       </w:r>
       <w:r>
         <w:rPr>
           <w:b/>
         </w:rPr>
-        <w:t>Meat</w:t>
-      </w:r>
-      <w:r>
-        <w:t xml:space="preserve"> (25M, budget tank), </w:t>
+        <w:t>Corvus</w:t>
+      </w:r>
+      <w:r>
+        <w:t xml:space="preserve"> (apex ranged DD) — they repurpose stock trust spell IDs (899/901/902), so the client menu shows the old name (Excenmille / Nanaa Mihgo / Curilla). </w:t>
       </w:r>
       <w:r>
         <w:rPr>
           <w:b/>
         </w:rPr>
-        <w:t>Corvus</w:t>
-      </w:r>
-      <w:r>
-        <w:t xml:space="preserve"> (75M, apex ranged DD) — they repurpose stock trust spell IDs, so the client menu shows the old name. Companion modules block the retail NPCs from handing the repurposed IDs out free.</w:t>
+        <w:t>Relaunch: these are EARNED through Hunting League, not bought with gil</w:t>
+      </w:r>
+      <w:r>
+        <w:t xml:space="preserve"> — each is gated on an HL rank *and* a Hunt Marks cost (one unlock/char, spell permanently added on payment): </w:t>
+      </w:r>
+      <w:r>
+        <w:rPr>
+          <w:b/>
+        </w:rPr>
+        <w:t>Meat = Rank 2 / 2,000 marks, Gemma = Rank 3 / 3,000 marks, Corvus = Rank 4 / 5,000 marks</w:t>
+      </w:r>
+      <w:r>
+        <w:t xml:space="preserve">. (The NPC's lore quips still say "50M gil" — flavor text only; the purchase path spends HL_Points.) The give-everything </w:t>
+      </w:r>
+      <w:r>
+        <w:rPr>
+          <w:rFonts w:ascii="Consolas" w:hAnsi="Consolas"/>
+          <w:sz w:val="19"/>
+        </w:rPr>
+        <w:t>Character_Upgrader</w:t>
+      </w:r>
+      <w:r>
+        <w:t xml:space="preserve"> and the retail-NPC handlers still exclude these IDs so they can't leak free.</w:t>
+      </w:r>
+    </w:p>
+    <w:p>
+      <w:pPr>
+        <w:pStyle w:val="Heading2"/>
+      </w:pPr>
+      <w:r>
+        <w:t>4.4 Spell &amp; Skill Mastery (relaunch-new — replaced the retired AoE Weapon Skill)</w:t>
+      </w:r>
+    </w:p>
+    <w:p>
+      <w:r>
+        <w:t xml:space="preserve">A WS/spell empowerment system at the </w:t>
+      </w:r>
+      <w:r>
+        <w:rPr>
+          <w:b/>
+        </w:rPr>
+        <w:t>Mastery Sage</w:t>
+      </w:r>
+      <w:r>
+        <w:t xml:space="preserve"> NPC in </w:t>
+      </w:r>
+      <w:r>
+        <w:rPr>
+          <w:b/>
+        </w:rPr>
+        <w:t>Leafallia</w:t>
+      </w:r>
+      <w:r>
+        <w:t xml:space="preserve"> (x −8, z 20), spending a new currency — </w:t>
+      </w:r>
+      <w:r>
+        <w:rPr>
+          <w:b/>
+        </w:rPr>
+        <w:t>Mastery Sigils</w:t>
+      </w:r>
+      <w:r>
+        <w:t xml:space="preserve"> (charVar </w:t>
+      </w:r>
+      <w:r>
+        <w:rPr>
+          <w:rFonts w:ascii="Consolas" w:hAnsi="Consolas"/>
+          <w:sz w:val="19"/>
+        </w:rPr>
+        <w:t>MasterySigils</w:t>
+      </w:r>
+      <w:r>
+        <w:t xml:space="preserve">). Buy upgrades at the NPC; </w:t>
+      </w:r>
+      <w:r>
+        <w:rPr>
+          <w:b/>
+        </w:rPr>
+        <w:t>`!empower`</w:t>
+      </w:r>
+      <w:r>
+        <w:t xml:space="preserve"> shows your balance + everything you own (</w:t>
+      </w:r>
+      <w:r>
+        <w:rPr>
+          <w:rFonts w:ascii="Consolas" w:hAnsi="Consolas"/>
+          <w:sz w:val="19"/>
+        </w:rPr>
+        <w:t>!empower give &lt;n&gt;</w:t>
+      </w:r>
+      <w:r>
+        <w:t xml:space="preserve"> is a GM test faucet). It absorbed the old AoE-WS "splash" mechanic (now a Mastery WS Effect) when the Rupture Sage was retired (</w:t>
+      </w:r>
+      <w:r>
+        <w:rPr>
+          <w:rFonts w:ascii="Consolas" w:hAnsi="Consolas"/>
+          <w:sz w:val="19"/>
+        </w:rPr>
+        <w:t>a22038d3b5</w:t>
+      </w:r>
+      <w:r>
+        <w:t>).</w:t>
       </w:r>
     </w:p>
     <w:p>
@@ -3443,10 +3802,178 @@
         <w:rPr>
           <w:b/>
         </w:rPr>
-        <w:t>Player Trusts / Companion Master</w:t>
-      </w:r>
-      <w:r>
-        <w:t xml:space="preserve"> — party with a real player for 30 min to unlock each other as a summonable trust (or a quick stat-buff), with 5 gil-priced tiers (cumulative 16M).</w:t>
+        <w:t>Earning sigils</w:t>
+      </w:r>
+      <w:r>
+        <w:t xml:space="preserve"> (</w:t>
+      </w:r>
+      <w:r>
+        <w:rPr>
+          <w:rFonts w:ascii="Consolas" w:hAnsi="Consolas"/>
+          <w:sz w:val="19"/>
+        </w:rPr>
+        <w:t>spell_skill_mastery_catalog.lua</w:t>
+      </w:r>
+      <w:r>
+        <w:t xml:space="preserve">): the primary source is a </w:t>
+      </w:r>
+      <w:r>
+        <w:rPr>
+          <w:b/>
+        </w:rPr>
+        <w:t>daily NM rotation</w:t>
+      </w:r>
+      <w:r>
+        <w:t xml:space="preserve"> — 3 of a 20-NM overworld pool (Jaggedy-Eared Jack, King Arthro, Kraken, Nue, Guivre…) are "live" each 24 h, derived from the clock (no DB); killing a live target = </w:t>
+      </w:r>
+      <w:r>
+        <w:rPr>
+          <w:b/>
+        </w:rPr>
+        <w:t>50 sigils</w:t>
+      </w:r>
+      <w:r>
+        <w:t xml:space="preserve">, once per target per period, </w:t>
+      </w:r>
+      <w:r>
+        <w:rPr>
+          <w:b/>
+        </w:rPr>
+        <w:t>party-wide</w:t>
+      </w:r>
+      <w:r>
+        <w:t xml:space="preserve"> (every same-zone party member). The pool is deliberately distinct from the HL / Reforge / Hunters'-Guild NM sets. A small </w:t>
+      </w:r>
+      <w:r>
+        <w:rPr>
+          <w:b/>
+        </w:rPr>
+        <w:t>trickle</w:t>
+      </w:r>
+      <w:r>
+        <w:t xml:space="preserve"> (2 + 0.03×mob level, cap 10) drops on any NM so you're never fully dry between rotation targets.</w:t>
+      </w:r>
+    </w:p>
+    <w:p>
+      <w:pPr>
+        <w:pStyle w:val="ListBullet"/>
+      </w:pPr>
+      <w:r>
+        <w:rPr>
+          <w:b/>
+        </w:rPr>
+        <w:t>Potency</w:t>
+      </w:r>
+      <w:r>
+        <w:t xml:space="preserve"> (5 tiers, cost 15/30/55/90/140 sigils; additive mods re-applied on login): </w:t>
+      </w:r>
+      <w:r>
+        <w:rPr>
+          <w:b/>
+        </w:rPr>
+        <w:t>WS Potency</w:t>
+      </w:r>
+      <w:r>
+        <w:t xml:space="preserve"> +8% all-WS damage per tier; </w:t>
+      </w:r>
+      <w:r>
+        <w:rPr>
+          <w:b/>
+        </w:rPr>
+        <w:t>Spell Potency</w:t>
+      </w:r>
+      <w:r>
+        <w:t xml:space="preserve"> +6 M.Atk / +8 magic dmg / +5% cure potency per tier.</w:t>
+      </w:r>
+    </w:p>
+    <w:p>
+      <w:pPr>
+        <w:pStyle w:val="ListBullet"/>
+      </w:pPr>
+      <w:r>
+        <w:rPr>
+          <w:b/>
+        </w:rPr>
+        <w:t>WS Effects</w:t>
+      </w:r>
+      <w:r>
+        <w:t xml:space="preserve"> (5 tiers, cost 20/40/70/110/160; live </w:t>
+      </w:r>
+      <w:r>
+        <w:rPr>
+          <w:rFonts w:ascii="Consolas" w:hAnsi="Consolas"/>
+          <w:sz w:val="19"/>
+        </w:rPr>
+        <w:t>WEAPONSKILL_USE</w:t>
+      </w:r>
+      <w:r>
+        <w:t xml:space="preserve"> procs, read from charVars so no re-apply): </w:t>
+      </w:r>
+      <w:r>
+        <w:rPr>
+          <w:b/>
+        </w:rPr>
+        <w:t>Empowered Strike</w:t>
+      </w:r>
+      <w:r>
+        <w:t xml:space="preserve"> (+8% crit-burst chance, +60% damage, per tier), </w:t>
+      </w:r>
+      <w:r>
+        <w:rPr>
+          <w:b/>
+        </w:rPr>
+        <w:t>Splash</w:t>
+      </w:r>
+      <w:r>
+        <w:t xml:space="preserve"> (+12% of WS damage to foes within 10 y per tier — the old AoE-WS mechanic), </w:t>
+      </w:r>
+      <w:r>
+        <w:rPr>
+          <w:b/>
+        </w:rPr>
+        <w:t>Lifesteal</w:t>
+      </w:r>
+      <w:r>
+        <w:t xml:space="preserve"> (heal +4% of WS damage per tier).</w:t>
+      </w:r>
+    </w:p>
+    <w:p>
+      <w:pPr>
+        <w:pStyle w:val="ListBullet"/>
+      </w:pPr>
+      <w:r>
+        <w:rPr>
+          <w:b/>
+        </w:rPr>
+        <w:t>Trait riders</w:t>
+      </w:r>
+      <w:r>
+        <w:t xml:space="preserve"> (one-time, 40 sigils each): WS — Store TP +10, WS Acc +20, Crit Rate +6%, Crit Dmg +10%, TP Saver (20% chance no TP cost), Double Atk +5%; Spell — Fast Cast +10%, Conserve MP +20, Magic Acc +20, Regain, Enh. Duration +20%, Focus (−20% interrupt rate).</w:t>
+      </w:r>
+    </w:p>
+    <w:p>
+      <w:r>
+        <w:t>Pure-Lua (</w:t>
+      </w:r>
+      <w:r>
+        <w:rPr>
+          <w:rFonts w:ascii="Consolas" w:hAnsi="Consolas"/>
+          <w:sz w:val="19"/>
+        </w:rPr>
+        <w:t>SpellSkillMastery.lua</w:t>
+      </w:r>
+      <w:r>
+        <w:t xml:space="preserve">): potency/traits via </w:t>
+      </w:r>
+      <w:r>
+        <w:rPr>
+          <w:rFonts w:ascii="Consolas" w:hAnsi="Consolas"/>
+          <w:sz w:val="19"/>
+        </w:rPr>
+        <w:t>addMod</w:t>
+      </w:r>
+      <w:r>
+        <w:t xml:space="preserve"> + onGameIn re-apply; WS Effects read charVars live each weapon skill. All balance values are PLACEHOLDER pending playtest. LIVE on relaunch.</w:t>
       </w:r>
     </w:p>
     <w:p/>
@@ -3663,7 +4190,16 @@
           </w:tcPr>
           <w:p>
             <w:r>
-              <w:t>win 150 marks (+underdog), daily win cap 15</w:t>
+              <w:t xml:space="preserve">win </w:t>
+            </w:r>
+            <w:r>
+              <w:rPr>
+                <w:b/>
+              </w:rPr>
+              <w:t>10 marks</w:t>
+            </w:r>
+            <w:r>
+              <w:t xml:space="preserve"> (+underdog), loss 25 consolation, daily win cap 15</w:t>
             </w:r>
           </w:p>
         </w:tc>
@@ -3701,7 +4237,16 @@
           </w:tcPr>
           <w:p>
             <w:r>
-              <w:t>Voidspire Warden (Escha-RuAun)</w:t>
+              <w:t xml:space="preserve">Voidspire Warden (Escha-RuAun </w:t>
+            </w:r>
+            <w:r>
+              <w:rPr>
+                <w:b/>
+              </w:rPr>
+              <w:t>south/entry plaza</w:t>
+            </w:r>
+            <w:r>
+              <w:t>, ×3 copies)</w:t>
             </w:r>
           </w:p>
         </w:tc>
@@ -3728,13 +4273,22 @@
               <w:t>5+2×floor</w:t>
             </w:r>
             <w:r>
-              <w:t xml:space="preserve"> marks; depth milestones 2.5k-70k marks </w:t>
+              <w:t xml:space="preserve"> marks; depth milestones (floor 10/25/50/75/100 = </w:t>
             </w:r>
             <w:r>
               <w:rPr>
                 <w:b/>
               </w:rPr>
-              <w:t>now once/week</w:t>
+              <w:t>50/150/350/600/1000</w:t>
+            </w:r>
+            <w:r>
+              <w:t xml:space="preserve"> marks), each </w:t>
+            </w:r>
+            <w:r>
+              <w:rPr>
+                <w:b/>
+              </w:rPr>
+              <w:t>once/week</w:t>
             </w:r>
           </w:p>
         </w:tc>
@@ -3769,7 +4323,16 @@
           </w:tcPr>
           <w:p>
             <w:r>
-              <w:t>Voidgate Sentinel (Escha-RuAun)</w:t>
+              <w:t xml:space="preserve">Voidgate Sentinel (Escha-RuAun </w:t>
+            </w:r>
+            <w:r>
+              <w:rPr>
+                <w:b/>
+              </w:rPr>
+              <w:t>north area</w:t>
+            </w:r>
+            <w:r>
+              <w:t>, ×3 copies)</w:t>
             </w:r>
           </w:p>
         </w:tc>
@@ -4673,30 +5236,30 @@
         <w:rPr>
           <w:b/>
         </w:rPr>
-        <w:t>`!aoews` command added</w:t>
-      </w:r>
-      <w:r>
-        <w:t xml:space="preserve"> (</w:t>
+        <w:t>AoE Weapon Skill retired → folded into Spell &amp; Skill Mastery</w:t>
+      </w:r>
+      <w:r>
+        <w:t xml:space="preserve"> — the mastery rollout (</w:t>
       </w:r>
       <w:r>
         <w:rPr>
           <w:rFonts w:ascii="Consolas" w:hAnsi="Consolas"/>
           <w:sz w:val="19"/>
         </w:rPr>
-        <w:t>modules/custom/commands/aoews.lua</w:t>
-      </w:r>
-      <w:r>
-        <w:t xml:space="preserve">) → the AoE-Weapon-Skill unlock now works: </w:t>
+        <w:t>a22038d3b5</w:t>
+      </w:r>
+      <w:r>
+        <w:t xml:space="preserve">) removed the Rupture Sage / AoE-WS feature entirely; its splash is now a Mastery "Splash" WS Effect (see §4.4). *(An earlier standalone </w:t>
       </w:r>
       <w:r>
         <w:rPr>
           <w:rFonts w:ascii="Consolas" w:hAnsi="Consolas"/>
           <w:sz w:val="19"/>
         </w:rPr>
-        <w:t>!aoews &lt;name&gt;</w:t>
-      </w:r>
-      <w:r>
-        <w:t xml:space="preserve"> binds the splash WS (was purchasable-but-inert). *Needs a map restart (new command file).*</w:t>
+        <w:t>!aoews</w:t>
+      </w:r>
+      <w:r>
+        <w:t xml:space="preserve"> fix was therefore obsoleted and dropped with the feature.)*</w:t>
       </w:r>
     </w:p>
     <w:p>
@@ -4768,7 +5331,7 @@
         <w:t>auto_buff_henge</w:t>
       </w:r>
       <w:r>
-        <w:t xml:space="preserve"> "30 min"→5 h (incl. the player message), </w:t>
+        <w:t xml:space="preserve"> "30 min"→5 h (incl. the player message). *(The </w:t>
       </w:r>
       <w:r>
         <w:rPr>
@@ -4778,7 +5341,7 @@
         <w:t>!gainexp</w:t>
       </w:r>
       <w:r>
-        <w:t xml:space="preserve"> "GM-only/no cooldown"→all-players/24 h.</w:t>
+        <w:t xml:space="preserve"> comment-fix from this pass is now moot — the command was deleted in the later owner batch; see below.)*</w:t>
       </w:r>
     </w:p>
     <w:p>
@@ -4886,6 +5449,204 @@
       </w:r>
       <w:r>
         <w:t>.</w:t>
+      </w:r>
+    </w:p>
+    <w:p>
+      <w:r>
+        <w:rPr>
+          <w:b/>
+        </w:rPr>
+        <w:t>Removed in the 2026-06-25 owner batch (commit `43c2ede8f8`):</w:t>
+      </w:r>
+    </w:p>
+    <w:p>
+      <w:pPr>
+        <w:pStyle w:val="ListBullet"/>
+      </w:pPr>
+      <w:r>
+        <w:rPr>
+          <w:b/>
+        </w:rPr>
+        <w:t>Always-on "Gain Experience" RoE</w:t>
+      </w:r>
+      <w:r>
+        <w:t xml:space="preserve"> module + </w:t>
+      </w:r>
+      <w:r>
+        <w:rPr>
+          <w:b/>
+        </w:rPr>
+        <w:t>`!gainexp`</w:t>
+      </w:r>
+      <w:r>
+        <w:t xml:space="preserve"> command — gone; RoE reverts to retail rotation (§2.2).</w:t>
+      </w:r>
+    </w:p>
+    <w:p>
+      <w:pPr>
+        <w:pStyle w:val="ListBullet"/>
+      </w:pPr>
+      <w:r>
+        <w:rPr>
+          <w:b/>
+        </w:rPr>
+        <w:t>All custom spells</w:t>
+      </w:r>
+      <w:r>
+        <w:t xml:space="preserve"> — </w:t>
+      </w:r>
+      <w:r>
+        <w:rPr>
+          <w:rFonts w:ascii="Consolas" w:hAnsi="Consolas"/>
+          <w:sz w:val="19"/>
+        </w:rPr>
+        <w:t>!aegis</w:t>
+      </w:r>
+      <w:r>
+        <w:t>/</w:t>
+      </w:r>
+      <w:r>
+        <w:rPr>
+          <w:rFonts w:ascii="Consolas" w:hAnsi="Consolas"/>
+          <w:sz w:val="19"/>
+        </w:rPr>
+        <w:t>!convergence</w:t>
+      </w:r>
+      <w:r>
+        <w:t>/</w:t>
+      </w:r>
+      <w:r>
+        <w:rPr>
+          <w:rFonts w:ascii="Consolas" w:hAnsi="Consolas"/>
+          <w:sz w:val="19"/>
+        </w:rPr>
+        <w:t>!silencega</w:t>
+      </w:r>
+      <w:r>
+        <w:t xml:space="preserve"> commands, their spell scripts, the </w:t>
+      </w:r>
+      <w:r>
+        <w:rPr>
+          <w:rFonts w:ascii="Consolas" w:hAnsi="Consolas"/>
+          <w:sz w:val="19"/>
+        </w:rPr>
+        <w:t>custom_spell_ids</w:t>
+      </w:r>
+      <w:r>
+        <w:t>/</w:t>
+      </w:r>
+      <w:r>
+        <w:rPr>
+          <w:rFonts w:ascii="Consolas" w:hAnsi="Consolas"/>
+          <w:sz w:val="19"/>
+        </w:rPr>
+        <w:t>custom_spell_command</w:t>
+      </w:r>
+      <w:r>
+        <w:t xml:space="preserve"> modules, </w:t>
+      </w:r>
+      <w:r>
+        <w:rPr>
+          <w:rFonts w:ascii="Consolas" w:hAnsi="Consolas"/>
+          <w:sz w:val="19"/>
+        </w:rPr>
+        <w:t>custom_spells.sql</w:t>
+      </w:r>
+      <w:r>
+        <w:t xml:space="preserve">, and the docgen page (§4.2). Spell IDs 1020/1021 are no longer in </w:t>
+      </w:r>
+      <w:r>
+        <w:rPr>
+          <w:rFonts w:ascii="Consolas" w:hAnsi="Consolas"/>
+          <w:sz w:val="19"/>
+        </w:rPr>
+        <w:t>spell_list</w:t>
+      </w:r>
+      <w:r>
+        <w:t xml:space="preserve">. ⚠ The HL reward shop's "Spells" rows were </w:t>
+      </w:r>
+      <w:r>
+        <w:rPr>
+          <w:b/>
+        </w:rPr>
+        <w:t>not</w:t>
+      </w:r>
+      <w:r>
+        <w:t xml:space="preserve"> removed and now point at dead </w:t>
+      </w:r>
+      <w:r>
+        <w:rPr>
+          <w:rFonts w:ascii="Consolas" w:hAnsi="Consolas"/>
+          <w:sz w:val="19"/>
+        </w:rPr>
+        <w:t>learnSpell</w:t>
+      </w:r>
+      <w:r>
+        <w:t xml:space="preserve"> ids (§2.3) — clean up </w:t>
+      </w:r>
+      <w:r>
+        <w:rPr>
+          <w:rFonts w:ascii="Consolas" w:hAnsi="Consolas"/>
+          <w:sz w:val="19"/>
+        </w:rPr>
+        <w:t>hunting_league_catalog.lua</w:t>
+      </w:r>
+      <w:r>
+        <w:t>.</w:t>
+      </w:r>
+    </w:p>
+    <w:p>
+      <w:pPr>
+        <w:pStyle w:val="ListBullet"/>
+      </w:pPr>
+      <w:r>
+        <w:rPr>
+          <w:b/>
+        </w:rPr>
+        <w:t>Player Trusts / "Companion Master"</w:t>
+      </w:r>
+      <w:r>
+        <w:t xml:space="preserve"> — the entire system is removed (</w:t>
+      </w:r>
+      <w:r>
+        <w:rPr>
+          <w:rFonts w:ascii="Consolas" w:hAnsi="Consolas"/>
+          <w:sz w:val="19"/>
+        </w:rPr>
+        <w:t>player_trusts_catalog.lua</w:t>
+      </w:r>
+      <w:r>
+        <w:t xml:space="preserve">, the </w:t>
+      </w:r>
+      <w:r>
+        <w:rPr>
+          <w:rFonts w:ascii="Consolas" w:hAnsi="Consolas"/>
+          <w:sz w:val="19"/>
+        </w:rPr>
+        <w:t>docs/community/player-trusts.md</w:t>
+      </w:r>
+      <w:r>
+        <w:t xml:space="preserve"> page, and the </w:t>
+      </w:r>
+      <w:r>
+        <w:rPr>
+          <w:rFonts w:ascii="Consolas" w:hAnsi="Consolas"/>
+          <w:sz w:val="19"/>
+        </w:rPr>
+        <w:t>player_trusts</w:t>
+      </w:r>
+      <w:r>
+        <w:t xml:space="preserve"> docgen generator all deleted; race-look data inlined into </w:t>
+      </w:r>
+      <w:r>
+        <w:rPr>
+          <w:rFonts w:ascii="Consolas" w:hAnsi="Consolas"/>
+          <w:sz w:val="19"/>
+        </w:rPr>
+        <w:t>Colosseum.lua</w:t>
+      </w:r>
+      <w:r>
+        <w:t>).</w:t>
       </w:r>
     </w:p>
     <w:p>

</xml_diff>

<commit_message>
docs(relaunch): add augment catalyst drop matrix + NM affinity-trophy table
§4.1 now includes two matrices grounded in augment_catalog.lua,
augment_catalyst_pools.lua, and augment_affinity_catalog.lua:
- Catalyst tier matrix (T0-T4): the Sage rank to use each tier, which NMs
  drop that tier's pool (HL Rank 1-2 -> T0, Rank 3 -> T1, Rank 4-5 -> T2,
  Prestige Lv15 -> T3, Shinryu/endgame -> T4), 50% roll, random-in-pool, and
  representative augments per tier.
- The 13 NM affinity trophies (specific NM -> trophy item id -> category, x1.5).
Regenerated the .docx.

Co-Authored-By: Claude Opus 4.8 <noreply@anthropic.com>
</commit_message>
<xml_diff>
--- a/RELAUNCH_AS_BUILT.docx
+++ b/RELAUNCH_AS_BUILT.docx
@@ -3346,6 +3346,1002 @@
         <w:t>Catalog design rule: job/pet/resist/skill augments are free (tier 0); universally-strong stats (Haste, DA/TA/QA, PDT/MDT, Dmg+, HP/MP, crit-dmg, TP/WS) are tier 3-4 (require higher Sage rank).</w:t>
       </w:r>
     </w:p>
+    <w:p>
+      <w:r>
+        <w:rPr>
+          <w:b/>
+        </w:rPr>
+        <w:t>Where catalysts drop — the tier matrix.</w:t>
+      </w:r>
+      <w:r>
+        <w:t xml:space="preserve"> Each catalyst carries a </w:t>
+      </w:r>
+      <w:r>
+        <w:rPr>
+          <w:rFonts w:ascii="Consolas" w:hAnsi="Consolas"/>
+          <w:sz w:val="19"/>
+        </w:rPr>
+        <w:t>tier</w:t>
+      </w:r>
+      <w:r>
+        <w:t xml:space="preserve"> (0-4) that is *both* the Augment Sage rank needed to use it *and* its drop pool. An eligible NM rolls one random catalyst from the pool matching its difficulty (</w:t>
+      </w:r>
+      <w:r>
+        <w:rPr>
+          <w:rFonts w:ascii="Consolas" w:hAnsi="Consolas"/>
+          <w:sz w:val="19"/>
+        </w:rPr>
+        <w:t>augment_catalyst_pools.lua</w:t>
+      </w:r>
+      <w:r>
+        <w:t xml:space="preserve">, </w:t>
+      </w:r>
+      <w:r>
+        <w:rPr>
+          <w:b/>
+        </w:rPr>
+        <w:t>50% per eligible kill</w:t>
+      </w:r>
+      <w:r>
+        <w:t xml:space="preserve">; *which* catalyst is uniform-random within the tier, so a specific augment is still a grind). This is *in addition* to any item's original droplist — it's the reliable farm that replaced the old </w:t>
+      </w:r>
+      <w:r>
+        <w:rPr>
+          <w:rFonts w:ascii="Consolas" w:hAnsi="Consolas"/>
+          <w:sz w:val="19"/>
+        </w:rPr>
+        <w:t>!shop</w:t>
+      </w:r>
+      <w:r>
+        <w:t xml:space="preserve"> gil purchase.</w:t>
+      </w:r>
+    </w:p>
+    <w:tbl>
+      <w:tblPr>
+        <w:tblStyle w:val="LightGrid-Accent1"/>
+        <w:tblW w:type="auto" w:w="0"/>
+        <w:tblLook w:firstColumn="1" w:firstRow="1" w:lastColumn="0" w:lastRow="0" w:noHBand="0" w:noVBand="1" w:val="04A0"/>
+      </w:tblPr>
+      <w:tblGrid>
+        <w:gridCol w:w="2160"/>
+        <w:gridCol w:w="2160"/>
+        <w:gridCol w:w="2160"/>
+        <w:gridCol w:w="2160"/>
+      </w:tblGrid>
+      <w:tr>
+        <w:tc>
+          <w:tcPr>
+            <w:tcW w:type="dxa" w:w="2160"/>
+          </w:tcPr>
+          <w:p>
+            <w:r>
+              <w:rPr>
+                <w:b/>
+              </w:rPr>
+              <w:t>Tier</w:t>
+            </w:r>
+          </w:p>
+        </w:tc>
+        <w:tc>
+          <w:tcPr>
+            <w:tcW w:type="dxa" w:w="2160"/>
+          </w:tcPr>
+          <w:p>
+            <w:r>
+              <w:rPr>
+                <w:b/>
+              </w:rPr>
+              <w:t>Sage rank to use</w:t>
+            </w:r>
+          </w:p>
+        </w:tc>
+        <w:tc>
+          <w:tcPr>
+            <w:tcW w:type="dxa" w:w="2160"/>
+          </w:tcPr>
+          <w:p>
+            <w:r>
+              <w:rPr>
+                <w:b/>
+              </w:rPr>
+              <w:t>Drops from</w:t>
+            </w:r>
+          </w:p>
+        </w:tc>
+        <w:tc>
+          <w:tcPr>
+            <w:tcW w:type="dxa" w:w="2160"/>
+          </w:tcPr>
+          <w:p>
+            <w:r>
+              <w:rPr>
+                <w:b/>
+              </w:rPr>
+              <w:t>In the pool (examples)</w:t>
+            </w:r>
+          </w:p>
+        </w:tc>
+      </w:tr>
+      <w:tr>
+        <w:tc>
+          <w:tcPr>
+            <w:tcW w:type="dxa" w:w="2160"/>
+          </w:tcPr>
+          <w:p>
+            <w:r>
+              <w:rPr>
+                <w:b/>
+              </w:rPr>
+              <w:t>T0</w:t>
+            </w:r>
+          </w:p>
+        </w:tc>
+        <w:tc>
+          <w:tcPr>
+            <w:tcW w:type="dxa" w:w="2160"/>
+          </w:tcPr>
+          <w:p>
+            <w:r>
+              <w:t>0 (free)</w:t>
+            </w:r>
+          </w:p>
+        </w:tc>
+        <w:tc>
+          <w:tcPr>
+            <w:tcW w:type="dxa" w:w="2160"/>
+          </w:tcPr>
+          <w:p>
+            <w:r>
+              <w:t>HL Rank 1-2 NMs — Leaping Lizzy, Valkurm Emperor, Tom Tit Tat, Roc, Bomb Queen, Aquarius</w:t>
+            </w:r>
+          </w:p>
+        </w:tc>
+        <w:tc>
+          <w:tcPr>
+            <w:tcW w:type="dxa" w:w="2160"/>
+          </w:tcPr>
+          <w:p>
+            <w:r>
+              <w:t>all elemental resists &amp; affinities, status resists, job ability-delay cuts (BP / Call Beast / Quick Draw / Waltz / song / magic recast), Exp/Cap +33%, Slow, Gilfinder, Enmity, Beast / Phantom-Roll / Thunder affinity</w:t>
+            </w:r>
+          </w:p>
+        </w:tc>
+      </w:tr>
+      <w:tr>
+        <w:tc>
+          <w:tcPr>
+            <w:tcW w:type="dxa" w:w="2160"/>
+          </w:tcPr>
+          <w:p>
+            <w:r>
+              <w:rPr>
+                <w:b/>
+              </w:rPr>
+              <w:t>T1</w:t>
+            </w:r>
+          </w:p>
+        </w:tc>
+        <w:tc>
+          <w:tcPr>
+            <w:tcW w:type="dxa" w:w="2160"/>
+          </w:tcPr>
+          <w:p>
+            <w:r>
+              <w:t>1 Initiate</w:t>
+            </w:r>
+          </w:p>
+        </w:tc>
+        <w:tc>
+          <w:tcPr>
+            <w:tcW w:type="dxa" w:w="2160"/>
+          </w:tcPr>
+          <w:p>
+            <w:r>
+              <w:t>HL Rank 3 — Serket, Vrtra, Simurgh</w:t>
+            </w:r>
+          </w:p>
+        </w:tc>
+        <w:tc>
+          <w:tcPr>
+            <w:tcW w:type="dxa" w:w="2160"/>
+          </w:tcPr>
+          <w:p>
+            <w:r>
+              <w:t xml:space="preserve">every weapon/magic </w:t>
+            </w:r>
+            <w:r>
+              <w:rPr>
+                <w:b/>
+              </w:rPr>
+              <w:t>Skill+</w:t>
+            </w:r>
+            <w:r>
+              <w:t xml:space="preserve">, most </w:t>
+            </w:r>
+            <w:r>
+              <w:rPr>
+                <w:b/>
+              </w:rPr>
+              <w:t>Pet</w:t>
+            </w:r>
+            <w:r>
+              <w:t xml:space="preserve"> stats, Counter, Martial Arts, Evasion / Mag.Eva, Drain/Aspir potency, Enhancing / Helix / Meditate duration, Shield Mastery / Block / Parry</w:t>
+            </w:r>
+          </w:p>
+        </w:tc>
+      </w:tr>
+      <w:tr>
+        <w:tc>
+          <w:tcPr>
+            <w:tcW w:type="dxa" w:w="2160"/>
+          </w:tcPr>
+          <w:p>
+            <w:r>
+              <w:rPr>
+                <w:b/>
+              </w:rPr>
+              <w:t>T2</w:t>
+            </w:r>
+          </w:p>
+        </w:tc>
+        <w:tc>
+          <w:tcPr>
+            <w:tcW w:type="dxa" w:w="2160"/>
+          </w:tcPr>
+          <w:p>
+            <w:r>
+              <w:t>2 Adept</w:t>
+            </w:r>
+          </w:p>
+        </w:tc>
+        <w:tc>
+          <w:tcPr>
+            <w:tcW w:type="dxa" w:w="2160"/>
+          </w:tcPr>
+          <w:p>
+            <w:r>
+              <w:t>HL Rank 4-5 — Nidhogg, King Behemoth, Kirin, Absolute Virtue, Pandemonium Warden</w:t>
+            </w:r>
+          </w:p>
+        </w:tc>
+        <w:tc>
+          <w:tcPr>
+            <w:tcW w:type="dxa" w:w="2160"/>
+          </w:tcPr>
+          <w:p>
+            <w:r>
+              <w:t xml:space="preserve">the 7 base stats (STR/DEX/VIT/AGI/INT/MND/CHR), </w:t>
+            </w:r>
+            <w:r>
+              <w:rPr>
+                <w:b/>
+              </w:rPr>
+              <w:t>Accuracy / Rng.Acc</w:t>
+            </w:r>
+            <w:r>
+              <w:t xml:space="preserve">, Store TP, Subtle Blow, </w:t>
+            </w:r>
+            <w:r>
+              <w:rPr>
+                <w:b/>
+              </w:rPr>
+              <w:t>DEF</w:t>
+            </w:r>
+            <w:r>
+              <w:t xml:space="preserve">, </w:t>
+            </w:r>
+            <w:r>
+              <w:rPr>
+                <w:b/>
+              </w:rPr>
+              <w:t>Mag.Acc / Mag.Atk.Bns</w:t>
+            </w:r>
+            <w:r>
+              <w:t xml:space="preserve">, </w:t>
+            </w:r>
+            <w:r>
+              <w:rPr>
+                <w:b/>
+              </w:rPr>
+              <w:t>Fast Cast</w:t>
+            </w:r>
+            <w:r>
+              <w:t>, Cure potency, Magic Damage, Snapshot</w:t>
+            </w:r>
+          </w:p>
+        </w:tc>
+      </w:tr>
+      <w:tr>
+        <w:tc>
+          <w:tcPr>
+            <w:tcW w:type="dxa" w:w="2160"/>
+          </w:tcPr>
+          <w:p>
+            <w:r>
+              <w:rPr>
+                <w:b/>
+              </w:rPr>
+              <w:t>T3</w:t>
+            </w:r>
+          </w:p>
+        </w:tc>
+        <w:tc>
+          <w:tcPr>
+            <w:tcW w:type="dxa" w:w="2160"/>
+          </w:tcPr>
+          <w:p>
+            <w:r>
+              <w:t>3 Magus</w:t>
+            </w:r>
+          </w:p>
+        </w:tc>
+        <w:tc>
+          <w:tcPr>
+            <w:tcW w:type="dxa" w:w="2160"/>
+          </w:tcPr>
+          <w:p>
+            <w:r>
+              <w:rPr>
+                <w:b/>
+              </w:rPr>
+              <w:t>Ascension / Prestige Trial bosses</w:t>
+            </w:r>
+            <w:r>
+              <w:t xml:space="preserve"> (Prestige Lv 15+)</w:t>
+            </w:r>
+          </w:p>
+        </w:tc>
+        <w:tc>
+          <w:tcPr>
+            <w:tcW w:type="dxa" w:w="2160"/>
+          </w:tcPr>
+          <w:p>
+            <w:r>
+              <w:rPr>
+                <w:b/>
+              </w:rPr>
+              <w:t>Attack / Rng.Atk</w:t>
+            </w:r>
+            <w:r>
+              <w:t xml:space="preserve">, </w:t>
+            </w:r>
+            <w:r>
+              <w:rPr>
+                <w:b/>
+              </w:rPr>
+              <w:t>Double Atk</w:t>
+            </w:r>
+            <w:r>
+              <w:t xml:space="preserve"> &amp; DA+crit, Crit rate, </w:t>
+            </w:r>
+            <w:r>
+              <w:rPr>
+                <w:b/>
+              </w:rPr>
+              <w:t>HP / MP / Regen / Refresh</w:t>
+            </w:r>
+            <w:r>
+              <w:t xml:space="preserve">, </w:t>
+            </w:r>
+            <w:r>
+              <w:rPr>
+                <w:b/>
+              </w:rPr>
+              <w:t>Weapon skill damage</w:t>
+            </w:r>
+            <w:r>
+              <w:t>, Skillchain / Magic-burst / Mag-crit dmg, weapon-delay cuts, Helix / Spikes dmg</w:t>
+            </w:r>
+          </w:p>
+        </w:tc>
+      </w:tr>
+      <w:tr>
+        <w:tc>
+          <w:tcPr>
+            <w:tcW w:type="dxa" w:w="2160"/>
+          </w:tcPr>
+          <w:p>
+            <w:r>
+              <w:rPr>
+                <w:b/>
+              </w:rPr>
+              <w:t>T4</w:t>
+            </w:r>
+          </w:p>
+        </w:tc>
+        <w:tc>
+          <w:tcPr>
+            <w:tcW w:type="dxa" w:w="2160"/>
+          </w:tcPr>
+          <w:p>
+            <w:r>
+              <w:t>4 Sage</w:t>
+            </w:r>
+          </w:p>
+        </w:tc>
+        <w:tc>
+          <w:tcPr>
+            <w:tcW w:type="dxa" w:w="2160"/>
+          </w:tcPr>
+          <w:p>
+            <w:r>
+              <w:rPr>
+                <w:b/>
+              </w:rPr>
+              <w:t>Shinryu</w:t>
+            </w:r>
+            <w:r>
+              <w:t xml:space="preserve"> (HL Rank-5 elite) + endgame</w:t>
+            </w:r>
+          </w:p>
+        </w:tc>
+        <w:tc>
+          <w:tcPr>
+            <w:tcW w:type="dxa" w:w="2160"/>
+          </w:tcPr>
+          <w:p>
+            <w:r>
+              <w:t xml:space="preserve">the BiS power augments: </w:t>
+            </w:r>
+            <w:r>
+              <w:rPr>
+                <w:b/>
+              </w:rPr>
+              <w:t>Haste</w:t>
+            </w:r>
+            <w:r>
+              <w:t xml:space="preserve">, </w:t>
+            </w:r>
+            <w:r>
+              <w:rPr>
+                <w:b/>
+              </w:rPr>
+              <w:t>Triple / Quadruple Attack</w:t>
+            </w:r>
+            <w:r>
+              <w:t xml:space="preserve">, </w:t>
+            </w:r>
+            <w:r>
+              <w:rPr>
+                <w:b/>
+              </w:rPr>
+              <w:t>TP Bonus</w:t>
+            </w:r>
+            <w:r>
+              <w:t xml:space="preserve">, </w:t>
+            </w:r>
+            <w:r>
+              <w:rPr>
+                <w:b/>
+              </w:rPr>
+              <w:t>Crit. hit damage</w:t>
+            </w:r>
+            <w:r>
+              <w:t xml:space="preserve">, </w:t>
+            </w:r>
+            <w:r>
+              <w:rPr>
+                <w:b/>
+              </w:rPr>
+              <w:t>PDT / MDT</w:t>
+            </w:r>
+            <w:r>
+              <w:t xml:space="preserve"> (−phys/magic dmg taken), </w:t>
+            </w:r>
+            <w:r>
+              <w:rPr>
+                <w:b/>
+              </w:rPr>
+              <w:t>Dmg+</w:t>
+            </w:r>
+            <w:r>
+              <w:t xml:space="preserve"> (melee/ranged)</w:t>
+            </w:r>
+          </w:p>
+        </w:tc>
+      </w:tr>
+    </w:tbl>
+    <w:p/>
+    <w:p>
+      <w:r>
+        <w:rPr>
+          <w:b/>
+        </w:rPr>
+        <w:t>NM affinity trophies (×1.5 to a whole category).</w:t>
+      </w:r>
+      <w:r>
+        <w:t xml:space="preserve"> A separate, *specific* drop: kill the signature NM and hand its trophy to the </w:t>
+      </w:r>
+      <w:r>
+        <w:rPr>
+          <w:b/>
+        </w:rPr>
+        <w:t>Augment Sage</w:t>
+      </w:r>
+      <w:r>
+        <w:t xml:space="preserve"> (plus the relaunch gate — HL Rank 3 + 1,000 Hunt Marks) to permanently ×1.5 that category's augments (</w:t>
+      </w:r>
+      <w:r>
+        <w:rPr>
+          <w:rFonts w:ascii="Consolas" w:hAnsi="Consolas"/>
+          <w:sz w:val="19"/>
+        </w:rPr>
+        <w:t>augment_affinity_catalog.lua</w:t>
+      </w:r>
+      <w:r>
+        <w:t>):</w:t>
+      </w:r>
+    </w:p>
+    <w:tbl>
+      <w:tblPr>
+        <w:tblStyle w:val="LightGrid-Accent1"/>
+        <w:tblW w:type="auto" w:w="0"/>
+        <w:tblLook w:firstColumn="1" w:firstRow="1" w:lastColumn="0" w:lastRow="0" w:noHBand="0" w:noVBand="1" w:val="04A0"/>
+      </w:tblPr>
+      <w:tblGrid>
+        <w:gridCol w:w="2880"/>
+        <w:gridCol w:w="2880"/>
+        <w:gridCol w:w="2880"/>
+      </w:tblGrid>
+      <w:tr>
+        <w:tc>
+          <w:tcPr>
+            <w:tcW w:type="dxa" w:w="2880"/>
+          </w:tcPr>
+          <w:p>
+            <w:r>
+              <w:rPr>
+                <w:b/>
+              </w:rPr>
+              <w:t>Category</w:t>
+            </w:r>
+          </w:p>
+        </w:tc>
+        <w:tc>
+          <w:tcPr>
+            <w:tcW w:type="dxa" w:w="2880"/>
+          </w:tcPr>
+          <w:p>
+            <w:r>
+              <w:rPr>
+                <w:b/>
+              </w:rPr>
+              <w:t>NM</w:t>
+            </w:r>
+          </w:p>
+        </w:tc>
+        <w:tc>
+          <w:tcPr>
+            <w:tcW w:type="dxa" w:w="2880"/>
+          </w:tcPr>
+          <w:p>
+            <w:r>
+              <w:rPr>
+                <w:b/>
+              </w:rPr>
+              <w:t>Trophy (item id)</w:t>
+            </w:r>
+          </w:p>
+        </w:tc>
+      </w:tr>
+      <w:tr>
+        <w:tc>
+          <w:tcPr>
+            <w:tcW w:type="dxa" w:w="2880"/>
+          </w:tcPr>
+          <w:p>
+            <w:r>
+              <w:t>1 — STR / Attack</w:t>
+            </w:r>
+          </w:p>
+        </w:tc>
+        <w:tc>
+          <w:tcPr>
+            <w:tcW w:type="dxa" w:w="2880"/>
+          </w:tcPr>
+          <w:p>
+            <w:r>
+              <w:t>Behemoth</w:t>
+            </w:r>
+          </w:p>
+        </w:tc>
+        <w:tc>
+          <w:tcPr>
+            <w:tcW w:type="dxa" w:w="2880"/>
+          </w:tcPr>
+          <w:p>
+            <w:r>
+              <w:t>Giant Femur (893)</w:t>
+            </w:r>
+          </w:p>
+        </w:tc>
+      </w:tr>
+      <w:tr>
+        <w:tc>
+          <w:tcPr>
+            <w:tcW w:type="dxa" w:w="2880"/>
+          </w:tcPr>
+          <w:p>
+            <w:r>
+              <w:t>2 — DEX / Accuracy</w:t>
+            </w:r>
+          </w:p>
+        </w:tc>
+        <w:tc>
+          <w:tcPr>
+            <w:tcW w:type="dxa" w:w="2880"/>
+          </w:tcPr>
+          <w:p>
+            <w:r>
+              <w:t>King Arthro</w:t>
+            </w:r>
+          </w:p>
+        </w:tc>
+        <w:tc>
+          <w:tcPr>
+            <w:tcW w:type="dxa" w:w="2880"/>
+          </w:tcPr>
+          <w:p>
+            <w:r>
+              <w:t>Emperor Arthro's Shell (8983)</w:t>
+            </w:r>
+          </w:p>
+        </w:tc>
+      </w:tr>
+      <w:tr>
+        <w:tc>
+          <w:tcPr>
+            <w:tcW w:type="dxa" w:w="2880"/>
+          </w:tcPr>
+          <w:p>
+            <w:r>
+              <w:t>3 — VIT / Defense</w:t>
+            </w:r>
+          </w:p>
+        </w:tc>
+        <w:tc>
+          <w:tcPr>
+            <w:tcW w:type="dxa" w:w="2880"/>
+          </w:tcPr>
+          <w:p>
+            <w:r>
+              <w:t>Adamantoise</w:t>
+            </w:r>
+          </w:p>
+        </w:tc>
+        <w:tc>
+          <w:tcPr>
+            <w:tcW w:type="dxa" w:w="2880"/>
+          </w:tcPr>
+          <w:p>
+            <w:r>
+              <w:t>Adamantoise Shell (908)</w:t>
+            </w:r>
+          </w:p>
+        </w:tc>
+      </w:tr>
+      <w:tr>
+        <w:tc>
+          <w:tcPr>
+            <w:tcW w:type="dxa" w:w="2880"/>
+          </w:tcPr>
+          <w:p>
+            <w:r>
+              <w:t>4 — AGI / Eva / Haste</w:t>
+            </w:r>
+          </w:p>
+        </w:tc>
+        <w:tc>
+          <w:tcPr>
+            <w:tcW w:type="dxa" w:w="2880"/>
+          </w:tcPr>
+          <w:p>
+            <w:r>
+              <w:t>Roc</w:t>
+            </w:r>
+          </w:p>
+        </w:tc>
+        <w:tc>
+          <w:tcPr>
+            <w:tcW w:type="dxa" w:w="2880"/>
+          </w:tcPr>
+          <w:p>
+            <w:r>
+              <w:t>Giant Bird Plume (843)</w:t>
+            </w:r>
+          </w:p>
+        </w:tc>
+      </w:tr>
+      <w:tr>
+        <w:tc>
+          <w:tcPr>
+            <w:tcW w:type="dxa" w:w="2880"/>
+          </w:tcPr>
+          <w:p>
+            <w:r>
+              <w:t>5 — INT / Magic</w:t>
+            </w:r>
+          </w:p>
+        </w:tc>
+        <w:tc>
+          <w:tcPr>
+            <w:tcW w:type="dxa" w:w="2880"/>
+          </w:tcPr>
+          <w:p>
+            <w:r>
+              <w:t>Ouryu (Guivre-tier wyrm)</w:t>
+            </w:r>
+          </w:p>
+        </w:tc>
+        <w:tc>
+          <w:tcPr>
+            <w:tcW w:type="dxa" w:w="2880"/>
+          </w:tcPr>
+          <w:p>
+            <w:r>
+              <w:t>Guivre's Skull (909)</w:t>
+            </w:r>
+          </w:p>
+        </w:tc>
+      </w:tr>
+      <w:tr>
+        <w:tc>
+          <w:tcPr>
+            <w:tcW w:type="dxa" w:w="2880"/>
+          </w:tcPr>
+          <w:p>
+            <w:r>
+              <w:t>6 — MND / Healing</w:t>
+            </w:r>
+          </w:p>
+        </w:tc>
+        <w:tc>
+          <w:tcPr>
+            <w:tcW w:type="dxa" w:w="2880"/>
+          </w:tcPr>
+          <w:p>
+            <w:r>
+              <w:t>Phoenix</w:t>
+            </w:r>
+          </w:p>
+        </w:tc>
+        <w:tc>
+          <w:tcPr>
+            <w:tcW w:type="dxa" w:w="2880"/>
+          </w:tcPr>
+          <w:p>
+            <w:r>
+              <w:t>Phoenix Feather (844)</w:t>
+            </w:r>
+          </w:p>
+        </w:tc>
+      </w:tr>
+      <w:tr>
+        <w:tc>
+          <w:tcPr>
+            <w:tcW w:type="dxa" w:w="2880"/>
+          </w:tcPr>
+          <w:p>
+            <w:r>
+              <w:t>7 — CHR / Charm / Enmity</w:t>
+            </w:r>
+          </w:p>
+        </w:tc>
+        <w:tc>
+          <w:tcPr>
+            <w:tcW w:type="dxa" w:w="2880"/>
+          </w:tcPr>
+          <w:p>
+            <w:r>
+              <w:t>Lady Lilith (Khimaira-tier)</w:t>
+            </w:r>
+          </w:p>
+        </w:tc>
+        <w:tc>
+          <w:tcPr>
+            <w:tcW w:type="dxa" w:w="2880"/>
+          </w:tcPr>
+          <w:p>
+            <w:r>
+              <w:t>Khimaira Mane (2372)</w:t>
+            </w:r>
+          </w:p>
+        </w:tc>
+      </w:tr>
+      <w:tr>
+        <w:tc>
+          <w:tcPr>
+            <w:tcW w:type="dxa" w:w="2880"/>
+          </w:tcPr>
+          <w:p>
+            <w:r>
+              <w:t>8 — HP / Regen</w:t>
+            </w:r>
+          </w:p>
+        </w:tc>
+        <w:tc>
+          <w:tcPr>
+            <w:tcW w:type="dxa" w:w="2880"/>
+          </w:tcPr>
+          <w:p>
+            <w:r>
+              <w:t>Fafnir</w:t>
+            </w:r>
+          </w:p>
+        </w:tc>
+        <w:tc>
+          <w:tcPr>
+            <w:tcW w:type="dxa" w:w="2880"/>
+          </w:tcPr>
+          <w:p>
+            <w:r>
+              <w:t>Wyvern Skin (1122)</w:t>
+            </w:r>
+          </w:p>
+        </w:tc>
+      </w:tr>
+      <w:tr>
+        <w:tc>
+          <w:tcPr>
+            <w:tcW w:type="dxa" w:w="2880"/>
+          </w:tcPr>
+          <w:p>
+            <w:r>
+              <w:t>9 — MP / Refresh</w:t>
+            </w:r>
+          </w:p>
+        </w:tc>
+        <w:tc>
+          <w:tcPr>
+            <w:tcW w:type="dxa" w:w="2880"/>
+          </w:tcPr>
+          <w:p>
+            <w:r>
+              <w:t>Vrtra</w:t>
+            </w:r>
+          </w:p>
+        </w:tc>
+        <w:tc>
+          <w:tcPr>
+            <w:tcW w:type="dxa" w:w="2880"/>
+          </w:tcPr>
+          <w:p>
+            <w:r>
+              <w:t>Vial of Dragon Blood (1133)</w:t>
+            </w:r>
+          </w:p>
+        </w:tc>
+      </w:tr>
+      <w:tr>
+        <w:tc>
+          <w:tcPr>
+            <w:tcW w:type="dxa" w:w="2880"/>
+          </w:tcPr>
+          <w:p>
+            <w:r>
+              <w:t>10 — Pet</w:t>
+            </w:r>
+          </w:p>
+        </w:tc>
+        <w:tc>
+          <w:tcPr>
+            <w:tcW w:type="dxa" w:w="2880"/>
+          </w:tcPr>
+          <w:p>
+            <w:r>
+              <w:t>King Vinegarroon</w:t>
+            </w:r>
+          </w:p>
+        </w:tc>
+        <w:tc>
+          <w:tcPr>
+            <w:tcW w:type="dxa" w:w="2880"/>
+          </w:tcPr>
+          <w:p>
+            <w:r>
+              <w:t>Sand Bat Fang (1015)</w:t>
+            </w:r>
+          </w:p>
+        </w:tc>
+      </w:tr>
+      <w:tr>
+        <w:tc>
+          <w:tcPr>
+            <w:tcW w:type="dxa" w:w="2880"/>
+          </w:tcPr>
+          <w:p>
+            <w:r>
+              <w:t>11 — Elemental resist</w:t>
+            </w:r>
+          </w:p>
+        </w:tc>
+        <w:tc>
+          <w:tcPr>
+            <w:tcW w:type="dxa" w:w="2880"/>
+          </w:tcPr>
+          <w:p>
+            <w:r>
+              <w:t>Khimaira</w:t>
+            </w:r>
+          </w:p>
+        </w:tc>
+        <w:tc>
+          <w:tcPr>
+            <w:tcW w:type="dxa" w:w="2880"/>
+          </w:tcPr>
+          <w:p>
+            <w:r>
+              <w:t>Khimaira Horn (2371)</w:t>
+            </w:r>
+          </w:p>
+        </w:tc>
+      </w:tr>
+      <w:tr>
+        <w:tc>
+          <w:tcPr>
+            <w:tcW w:type="dxa" w:w="2880"/>
+          </w:tcPr>
+          <w:p>
+            <w:r>
+              <w:t>12 — Skill+</w:t>
+            </w:r>
+          </w:p>
+        </w:tc>
+        <w:tc>
+          <w:tcPr>
+            <w:tcW w:type="dxa" w:w="2880"/>
+          </w:tcPr>
+          <w:p>
+            <w:r>
+              <w:t>Maat (proxy king-tier predator)</w:t>
+            </w:r>
+          </w:p>
+        </w:tc>
+        <w:tc>
+          <w:tcPr>
+            <w:tcW w:type="dxa" w:w="2880"/>
+          </w:tcPr>
+          <w:p>
+            <w:r>
+              <w:t>Gargantuan Black Tiger Fang (2893)</w:t>
+            </w:r>
+          </w:p>
+        </w:tc>
+      </w:tr>
+      <w:tr>
+        <w:tc>
+          <w:tcPr>
+            <w:tcW w:type="dxa" w:w="2880"/>
+          </w:tcPr>
+          <w:p>
+            <w:r>
+              <w:t>13 — Weaponskill DMG+</w:t>
+            </w:r>
+          </w:p>
+        </w:tc>
+        <w:tc>
+          <w:tcPr>
+            <w:tcW w:type="dxa" w:w="2880"/>
+          </w:tcPr>
+          <w:p>
+            <w:r>
+              <w:t>Tiamat</w:t>
+            </w:r>
+          </w:p>
+        </w:tc>
+        <w:tc>
+          <w:tcPr>
+            <w:tcW w:type="dxa" w:w="2880"/>
+          </w:tcPr>
+          <w:p>
+            <w:r>
+              <w:t>H.Q. Scorpion Shell (1473)</w:t>
+            </w:r>
+          </w:p>
+        </w:tc>
+      </w:tr>
+    </w:tbl>
+    <w:p/>
     <w:p>
       <w:pPr>
         <w:pStyle w:val="Heading2"/>

</xml_diff>